<commit_message>
Updated my diary and added validation for required API inputs
</commit_message>
<xml_diff>
--- a/docs/Diary.docx
+++ b/docs/Diary.docx
@@ -115,7 +115,10 @@
         <w:jc w:val="center"/>
       </w:pPr>
       <w:r>
-        <w:t>2024</w:t>
+        <w:t>202</w:t>
+      </w:r>
+      <w:r>
+        <w:t>6 - 2027</w:t>
       </w:r>
     </w:p>
     <w:p>
@@ -1237,21 +1240,7 @@
             <w:rStyle w:val="Hyperlink"/>
             <w:lang w:val="en-IE"/>
           </w:rPr>
-          <w:t xml:space="preserve">second-year Java </w:t>
-        </w:r>
-        <w:r>
-          <w:rPr>
-            <w:rStyle w:val="Hyperlink"/>
-            <w:lang w:val="en-IE"/>
-          </w:rPr>
-          <w:t>p</w:t>
-        </w:r>
-        <w:r>
-          <w:rPr>
-            <w:rStyle w:val="Hyperlink"/>
-            <w:lang w:val="en-IE"/>
-          </w:rPr>
-          <w:t>roject</w:t>
+          <w:t>second-year Java project</w:t>
         </w:r>
       </w:hyperlink>
       <w:r>
@@ -1638,48 +1627,40 @@
         </w:rPr>
         <w:t xml:space="preserve">. I followed the </w:t>
       </w:r>
-      <w:r>
-        <w:fldChar w:fldCharType="begin"/>
-      </w:r>
-      <w:r>
-        <w:instrText>HYPERLINK "https://www.baeldung.com/spring-rest-openapi-documentation?utm_source=chatgpt.com"</w:instrText>
-      </w:r>
-      <w:r>
-        <w:fldChar w:fldCharType="separate"/>
-      </w:r>
-      <w:proofErr w:type="spellStart"/>
-      <w:r>
-        <w:rPr>
-          <w:rStyle w:val="Hyperlink"/>
-          <w:lang w:val="en-IE"/>
-        </w:rPr>
-        <w:t>Baeldung</w:t>
-      </w:r>
-      <w:proofErr w:type="spellEnd"/>
-      <w:r>
-        <w:rPr>
-          <w:rStyle w:val="Hyperlink"/>
-          <w:lang w:val="en-IE"/>
-        </w:rPr>
-        <w:t xml:space="preserve"> OpenAPI and S</w:t>
-      </w:r>
-      <w:r>
-        <w:rPr>
-          <w:rStyle w:val="Hyperlink"/>
-          <w:lang w:val="en-IE"/>
-        </w:rPr>
-        <w:t>w</w:t>
-      </w:r>
-      <w:r>
-        <w:rPr>
-          <w:rStyle w:val="Hyperlink"/>
-          <w:lang w:val="en-IE"/>
-        </w:rPr>
-        <w:t>agger Guide</w:t>
-      </w:r>
-      <w:r>
-        <w:fldChar w:fldCharType="end"/>
-      </w:r>
+      <w:hyperlink r:id="rId11" w:history="1">
+        <w:proofErr w:type="spellStart"/>
+        <w:r>
+          <w:rPr>
+            <w:rStyle w:val="Hyperlink"/>
+            <w:lang w:val="en-IE"/>
+          </w:rPr>
+          <w:t>Baeldung</w:t>
+        </w:r>
+        <w:proofErr w:type="spellEnd"/>
+        <w:r>
+          <w:rPr>
+            <w:rStyle w:val="Hyperlink"/>
+            <w:lang w:val="en-IE"/>
+          </w:rPr>
+          <w:t xml:space="preserve"> </w:t>
+        </w:r>
+        <w:proofErr w:type="spellStart"/>
+        <w:r>
+          <w:rPr>
+            <w:rStyle w:val="Hyperlink"/>
+            <w:lang w:val="en-IE"/>
+          </w:rPr>
+          <w:t>OpenAPI</w:t>
+        </w:r>
+        <w:proofErr w:type="spellEnd"/>
+        <w:r>
+          <w:rPr>
+            <w:rStyle w:val="Hyperlink"/>
+            <w:lang w:val="en-IE"/>
+          </w:rPr>
+          <w:t xml:space="preserve"> and Swagger Guide</w:t>
+        </w:r>
+      </w:hyperlink>
       <w:r>
         <w:rPr>
           <w:lang w:val="en-IE"/>

</xml_diff>